<commit_message>
PM03 Class Activity completed
</commit_message>
<xml_diff>
--- a/PM 03/pm03-contact-form/evidence/Ryan Ward PM-03.docx
+++ b/PM 03/pm03-contact-form/evidence/Ryan Ward PM-03.docx
@@ -42,7 +42,7 @@
                     <pic:cNvPicPr/>
                   </pic:nvPicPr>
                   <pic:blipFill>
-                    <a:blip r:embed="rId5"/>
+                    <a:blip r:embed="rId4"/>
                     <a:stretch>
                       <a:fillRect/>
                     </a:stretch>
@@ -123,7 +123,7 @@
                     <pic:cNvPicPr/>
                   </pic:nvPicPr>
                   <pic:blipFill>
-                    <a:blip r:embed="rId6"/>
+                    <a:blip r:embed="rId5"/>
                     <a:stretch>
                       <a:fillRect/>
                     </a:stretch>
@@ -165,7 +165,7 @@
                     <pic:cNvPicPr/>
                   </pic:nvPicPr>
                   <pic:blipFill>
-                    <a:blip r:embed="rId7"/>
+                    <a:blip r:embed="rId6"/>
                     <a:stretch>
                       <a:fillRect/>
                     </a:stretch>
@@ -218,7 +218,7 @@
                     <pic:cNvPicPr/>
                   </pic:nvPicPr>
                   <pic:blipFill>
-                    <a:blip r:embed="rId8"/>
+                    <a:blip r:embed="rId7"/>
                     <a:stretch>
                       <a:fillRect/>
                     </a:stretch>
@@ -260,7 +260,7 @@
                     <pic:cNvPicPr/>
                   </pic:nvPicPr>
                   <pic:blipFill>
-                    <a:blip r:embed="rId9"/>
+                    <a:blip r:embed="rId8"/>
                     <a:stretch>
                       <a:fillRect/>
                     </a:stretch>
@@ -318,7 +318,7 @@
                     <pic:cNvPicPr/>
                   </pic:nvPicPr>
                   <pic:blipFill>
-                    <a:blip r:embed="rId10"/>
+                    <a:blip r:embed="rId9"/>
                     <a:stretch>
                       <a:fillRect/>
                     </a:stretch>
@@ -360,7 +360,7 @@
                     <pic:cNvPicPr/>
                   </pic:nvPicPr>
                   <pic:blipFill>
-                    <a:blip r:embed="rId11"/>
+                    <a:blip r:embed="rId10"/>
                     <a:stretch>
                       <a:fillRect/>
                     </a:stretch>
@@ -410,7 +410,7 @@
                     <pic:cNvPicPr/>
                   </pic:nvPicPr>
                   <pic:blipFill>
-                    <a:blip r:embed="rId12"/>
+                    <a:blip r:embed="rId11"/>
                     <a:stretch>
                       <a:fillRect/>
                     </a:stretch>
@@ -452,7 +452,7 @@
                     <pic:cNvPicPr/>
                   </pic:nvPicPr>
                   <pic:blipFill>
-                    <a:blip r:embed="rId13"/>
+                    <a:blip r:embed="rId12"/>
                     <a:stretch>
                       <a:fillRect/>
                     </a:stretch>
@@ -510,7 +510,7 @@
                     <pic:cNvPicPr/>
                   </pic:nvPicPr>
                   <pic:blipFill>
-                    <a:blip r:embed="rId14"/>
+                    <a:blip r:embed="rId13"/>
                     <a:stretch>
                       <a:fillRect/>
                     </a:stretch>
@@ -560,7 +560,7 @@
                     <pic:cNvPicPr/>
                   </pic:nvPicPr>
                   <pic:blipFill>
-                    <a:blip r:embed="rId15"/>
+                    <a:blip r:embed="rId14"/>
                     <a:stretch>
                       <a:fillRect/>
                     </a:stretch>
@@ -610,7 +610,7 @@
                     <pic:cNvPicPr/>
                   </pic:nvPicPr>
                   <pic:blipFill>
-                    <a:blip r:embed="rId16"/>
+                    <a:blip r:embed="rId15"/>
                     <a:stretch>
                       <a:fillRect/>
                     </a:stretch>
@@ -652,7 +652,7 @@
                     <pic:cNvPicPr/>
                   </pic:nvPicPr>
                   <pic:blipFill>
-                    <a:blip r:embed="rId17"/>
+                    <a:blip r:embed="rId16"/>
                     <a:stretch>
                       <a:fillRect/>
                     </a:stretch>
@@ -702,7 +702,7 @@
                     <pic:cNvPicPr/>
                   </pic:nvPicPr>
                   <pic:blipFill>
-                    <a:blip r:embed="rId18"/>
+                    <a:blip r:embed="rId17"/>
                     <a:stretch>
                       <a:fillRect/>
                     </a:stretch>
@@ -744,7 +744,7 @@
                     <pic:cNvPicPr/>
                   </pic:nvPicPr>
                   <pic:blipFill>
-                    <a:blip r:embed="rId19"/>
+                    <a:blip r:embed="rId18"/>
                     <a:stretch>
                       <a:fillRect/>
                     </a:stretch>
@@ -794,7 +794,7 @@
                     <pic:cNvPicPr/>
                   </pic:nvPicPr>
                   <pic:blipFill>
-                    <a:blip r:embed="rId20"/>
+                    <a:blip r:embed="rId19"/>
                     <a:stretch>
                       <a:fillRect/>
                     </a:stretch>
@@ -836,7 +836,7 @@
                     <pic:cNvPicPr/>
                   </pic:nvPicPr>
                   <pic:blipFill>
-                    <a:blip r:embed="rId21"/>
+                    <a:blip r:embed="rId20"/>
                     <a:stretch>
                       <a:fillRect/>
                     </a:stretch>
@@ -886,7 +886,7 @@
                     <pic:cNvPicPr/>
                   </pic:nvPicPr>
                   <pic:blipFill>
-                    <a:blip r:embed="rId22"/>
+                    <a:blip r:embed="rId21"/>
                     <a:stretch>
                       <a:fillRect/>
                     </a:stretch>
@@ -928,7 +928,7 @@
                     <pic:cNvPicPr/>
                   </pic:nvPicPr>
                   <pic:blipFill>
-                    <a:blip r:embed="rId23"/>
+                    <a:blip r:embed="rId22"/>
                     <a:stretch>
                       <a:fillRect/>
                     </a:stretch>
@@ -986,7 +986,7 @@
                     <pic:cNvPicPr/>
                   </pic:nvPicPr>
                   <pic:blipFill>
-                    <a:blip r:embed="rId24"/>
+                    <a:blip r:embed="rId23"/>
                     <a:stretch>
                       <a:fillRect/>
                     </a:stretch>
@@ -1028,7 +1028,7 @@
                     <pic:cNvPicPr/>
                   </pic:nvPicPr>
                   <pic:blipFill>
-                    <a:blip r:embed="rId25"/>
+                    <a:blip r:embed="rId24"/>
                     <a:stretch>
                       <a:fillRect/>
                     </a:stretch>
@@ -1070,7 +1070,7 @@
                     <pic:cNvPicPr/>
                   </pic:nvPicPr>
                   <pic:blipFill>
-                    <a:blip r:embed="rId26"/>
+                    <a:blip r:embed="rId25"/>
                     <a:stretch>
                       <a:fillRect/>
                     </a:stretch>
@@ -1123,7 +1123,7 @@
                     <pic:cNvPicPr/>
                   </pic:nvPicPr>
                   <pic:blipFill>
-                    <a:blip r:embed="rId27"/>
+                    <a:blip r:embed="rId26"/>
                     <a:stretch>
                       <a:fillRect/>
                     </a:stretch>
@@ -1165,7 +1165,7 @@
                     <pic:cNvPicPr/>
                   </pic:nvPicPr>
                   <pic:blipFill>
-                    <a:blip r:embed="rId28"/>
+                    <a:blip r:embed="rId27"/>
                     <a:stretch>
                       <a:fillRect/>
                     </a:stretch>
@@ -1207,7 +1207,7 @@
                     <pic:cNvPicPr/>
                   </pic:nvPicPr>
                   <pic:blipFill>
-                    <a:blip r:embed="rId29"/>
+                    <a:blip r:embed="rId28"/>
                     <a:stretch>
                       <a:fillRect/>
                     </a:stretch>
@@ -1257,7 +1257,7 @@
                     <pic:cNvPicPr/>
                   </pic:nvPicPr>
                   <pic:blipFill>
-                    <a:blip r:embed="rId30"/>
+                    <a:blip r:embed="rId29"/>
                     <a:stretch>
                       <a:fillRect/>
                     </a:stretch>
@@ -1299,7 +1299,7 @@
                     <pic:cNvPicPr/>
                   </pic:nvPicPr>
                   <pic:blipFill>
-                    <a:blip r:embed="rId31"/>
+                    <a:blip r:embed="rId30"/>
                     <a:stretch>
                       <a:fillRect/>
                     </a:stretch>
@@ -1357,7 +1357,7 @@
                     <pic:cNvPicPr/>
                   </pic:nvPicPr>
                   <pic:blipFill>
-                    <a:blip r:embed="rId32"/>
+                    <a:blip r:embed="rId31"/>
                     <a:stretch>
                       <a:fillRect/>
                     </a:stretch>
@@ -1399,6 +1399,59 @@
                     <pic:cNvPicPr/>
                   </pic:nvPicPr>
                   <pic:blipFill>
+                    <a:blip r:embed="rId32"/>
+                    <a:stretch>
+                      <a:fillRect/>
+                    </a:stretch>
+                  </pic:blipFill>
+                  <pic:spPr>
+                    <a:xfrm>
+                      <a:off x="0" y="0"/>
+                      <a:ext cx="5731510" cy="3248660"/>
+                    </a:xfrm>
+                    <a:prstGeom prst="rect">
+                      <a:avLst/>
+                    </a:prstGeom>
+                  </pic:spPr>
+                </pic:pic>
+              </a:graphicData>
+            </a:graphic>
+          </wp:inline>
+        </w:drawing>
+      </w:r>
+    </w:p>
+    <w:p>
+      <w:pPr>
+        <w:pStyle w:val="Heading3"/>
+      </w:pPr>
+      <w:r>
+        <w:t>Slight</w:t>
+      </w:r>
+      <w:r>
+        <w:t>ly Better Email Validation Function:</w:t>
+      </w:r>
+    </w:p>
+    <w:p>
+      <w:r>
+        <w:rPr>
+          <w:noProof/>
+        </w:rPr>
+        <w:drawing>
+          <wp:inline distT="0" distB="0" distL="0" distR="0" wp14:anchorId="03EDCD8A" wp14:editId="6455DAC0">
+            <wp:extent cx="5705475" cy="981075"/>
+            <wp:effectExtent l="0" t="0" r="9525" b="9525"/>
+            <wp:docPr id="1836760101" name="Picture 1" descr="The image displays a JavaScript function `isValidEmail` that checks if an input string is a valid email format using a regular expression.&#10;&#10;AI-generated content may be incorrect."/>
+            <wp:cNvGraphicFramePr>
+              <a:graphicFrameLocks xmlns:a="http://schemas.openxmlformats.org/drawingml/2006/main" noChangeAspect="1"/>
+            </wp:cNvGraphicFramePr>
+            <a:graphic xmlns:a="http://schemas.openxmlformats.org/drawingml/2006/main">
+              <a:graphicData uri="http://schemas.openxmlformats.org/drawingml/2006/picture">
+                <pic:pic xmlns:pic="http://schemas.openxmlformats.org/drawingml/2006/picture">
+                  <pic:nvPicPr>
+                    <pic:cNvPr id="1836760101" name="Picture 1" descr="The image displays a JavaScript function `isValidEmail` that checks if an input string is a valid email format using a regular expression.&#10;&#10;AI-generated content may be incorrect."/>
+                    <pic:cNvPicPr/>
+                  </pic:nvPicPr>
+                  <pic:blipFill>
                     <a:blip r:embed="rId33"/>
                     <a:stretch>
                       <a:fillRect/>
@@ -1407,19 +1460,196 @@
                   <pic:spPr>
                     <a:xfrm>
                       <a:off x="0" y="0"/>
-                      <a:ext cx="5731510" cy="3248660"/>
-                    </a:xfrm>
-                    <a:prstGeom prst="rect">
-                      <a:avLst/>
-                    </a:prstGeom>
-                  </pic:spPr>
-                </pic:pic>
-              </a:graphicData>
-            </a:graphic>
-          </wp:inline>
-        </w:drawing>
-      </w:r>
-    </w:p>
+                      <a:ext cx="5705475" cy="981075"/>
+                    </a:xfrm>
+                    <a:prstGeom prst="rect">
+                      <a:avLst/>
+                    </a:prstGeom>
+                  </pic:spPr>
+                </pic:pic>
+              </a:graphicData>
+            </a:graphic>
+          </wp:inline>
+        </w:drawing>
+      </w:r>
+    </w:p>
+    <w:p>
+      <w:pPr>
+        <w:pStyle w:val="Heading3"/>
+      </w:pPr>
+      <w:r>
+        <w:t>Show message function:</w:t>
+      </w:r>
+    </w:p>
+    <w:p>
+      <w:r>
+        <w:rPr>
+          <w:noProof/>
+        </w:rPr>
+        <w:drawing>
+          <wp:inline distT="0" distB="0" distL="0" distR="0" wp14:anchorId="22365778" wp14:editId="69AFDCAC">
+            <wp:extent cx="4981575" cy="1438275"/>
+            <wp:effectExtent l="0" t="0" r="9525" b="9525"/>
+            <wp:docPr id="443921270" name="Picture 1" descr="The image shows a code snippet with a JavaScript function to display messages and a snippet to validate email addresses, displaying true and false for valid and invalid emails respectively.&#10;&#10;AI-generated content may be incorrect."/>
+            <wp:cNvGraphicFramePr>
+              <a:graphicFrameLocks xmlns:a="http://schemas.openxmlformats.org/drawingml/2006/main" noChangeAspect="1"/>
+            </wp:cNvGraphicFramePr>
+            <a:graphic xmlns:a="http://schemas.openxmlformats.org/drawingml/2006/main">
+              <a:graphicData uri="http://schemas.openxmlformats.org/drawingml/2006/picture">
+                <pic:pic xmlns:pic="http://schemas.openxmlformats.org/drawingml/2006/picture">
+                  <pic:nvPicPr>
+                    <pic:cNvPr id="443921270" name="Picture 1" descr="The image shows a code snippet with a JavaScript function to display messages and a snippet to validate email addresses, displaying true and false for valid and invalid emails respectively.&#10;&#10;AI-generated content may be incorrect."/>
+                    <pic:cNvPicPr/>
+                  </pic:nvPicPr>
+                  <pic:blipFill>
+                    <a:blip r:embed="rId34"/>
+                    <a:stretch>
+                      <a:fillRect/>
+                    </a:stretch>
+                  </pic:blipFill>
+                  <pic:spPr>
+                    <a:xfrm>
+                      <a:off x="0" y="0"/>
+                      <a:ext cx="4981575" cy="1438275"/>
+                    </a:xfrm>
+                    <a:prstGeom prst="rect">
+                      <a:avLst/>
+                    </a:prstGeom>
+                  </pic:spPr>
+                </pic:pic>
+              </a:graphicData>
+            </a:graphic>
+          </wp:inline>
+        </w:drawing>
+      </w:r>
+    </w:p>
+    <w:p>
+      <w:r>
+        <w:rPr>
+          <w:noProof/>
+        </w:rPr>
+        <w:drawing>
+          <wp:inline distT="0" distB="0" distL="0" distR="0" wp14:anchorId="45D41D60" wp14:editId="7FB48953">
+            <wp:extent cx="5731510" cy="4150360"/>
+            <wp:effectExtent l="0" t="0" r="2540" b="2540"/>
+            <wp:docPr id="1329273337" name="Picture 1" descr="The image shows a webpage with a form for submitting an error report to the Helpdesk, where an email address field is incorrectly filled out.&#10;&#10;AI-generated content may be incorrect."/>
+            <wp:cNvGraphicFramePr>
+              <a:graphicFrameLocks xmlns:a="http://schemas.openxmlformats.org/drawingml/2006/main" noChangeAspect="1"/>
+            </wp:cNvGraphicFramePr>
+            <a:graphic xmlns:a="http://schemas.openxmlformats.org/drawingml/2006/main">
+              <a:graphicData uri="http://schemas.openxmlformats.org/drawingml/2006/picture">
+                <pic:pic xmlns:pic="http://schemas.openxmlformats.org/drawingml/2006/picture">
+                  <pic:nvPicPr>
+                    <pic:cNvPr id="1329273337" name="Picture 1" descr="The image shows a webpage with a form for submitting an error report to the Helpdesk, where an email address field is incorrectly filled out.&#10;&#10;AI-generated content may be incorrect."/>
+                    <pic:cNvPicPr/>
+                  </pic:nvPicPr>
+                  <pic:blipFill>
+                    <a:blip r:embed="rId35"/>
+                    <a:stretch>
+                      <a:fillRect/>
+                    </a:stretch>
+                  </pic:blipFill>
+                  <pic:spPr>
+                    <a:xfrm>
+                      <a:off x="0" y="0"/>
+                      <a:ext cx="5731510" cy="4150360"/>
+                    </a:xfrm>
+                    <a:prstGeom prst="rect">
+                      <a:avLst/>
+                    </a:prstGeom>
+                  </pic:spPr>
+                </pic:pic>
+              </a:graphicData>
+            </a:graphic>
+          </wp:inline>
+        </w:drawing>
+      </w:r>
+    </w:p>
+    <w:p>
+      <w:r>
+        <w:rPr>
+          <w:noProof/>
+        </w:rPr>
+        <w:drawing>
+          <wp:inline distT="0" distB="0" distL="0" distR="0" wp14:anchorId="214FBAD1" wp14:editId="14872F72">
+            <wp:extent cx="5731510" cy="1678940"/>
+            <wp:effectExtent l="0" t="0" r="2540" b="0"/>
+            <wp:docPr id="229497036" name="Picture 1" descr="The image displays a web interface with a form, including fields for submitting an email address and a message, and error messages regarding unrecognized keys.&#10;&#10;AI-generated content may be incorrect."/>
+            <wp:cNvGraphicFramePr>
+              <a:graphicFrameLocks xmlns:a="http://schemas.openxmlformats.org/drawingml/2006/main" noChangeAspect="1"/>
+            </wp:cNvGraphicFramePr>
+            <a:graphic xmlns:a="http://schemas.openxmlformats.org/drawingml/2006/main">
+              <a:graphicData uri="http://schemas.openxmlformats.org/drawingml/2006/picture">
+                <pic:pic xmlns:pic="http://schemas.openxmlformats.org/drawingml/2006/picture">
+                  <pic:nvPicPr>
+                    <pic:cNvPr id="229497036" name="Picture 1" descr="The image displays a web interface with a form, including fields for submitting an email address and a message, and error messages regarding unrecognized keys.&#10;&#10;AI-generated content may be incorrect."/>
+                    <pic:cNvPicPr/>
+                  </pic:nvPicPr>
+                  <pic:blipFill>
+                    <a:blip r:embed="rId36"/>
+                    <a:stretch>
+                      <a:fillRect/>
+                    </a:stretch>
+                  </pic:blipFill>
+                  <pic:spPr>
+                    <a:xfrm>
+                      <a:off x="0" y="0"/>
+                      <a:ext cx="5731510" cy="1678940"/>
+                    </a:xfrm>
+                    <a:prstGeom prst="rect">
+                      <a:avLst/>
+                    </a:prstGeom>
+                  </pic:spPr>
+                </pic:pic>
+              </a:graphicData>
+            </a:graphic>
+          </wp:inline>
+        </w:drawing>
+      </w:r>
+    </w:p>
+    <w:p>
+      <w:r>
+        <w:rPr>
+          <w:noProof/>
+        </w:rPr>
+        <w:drawing>
+          <wp:inline distT="0" distB="0" distL="0" distR="0" wp14:anchorId="488EFDAD" wp14:editId="4692140A">
+            <wp:extent cx="5731510" cy="1556385"/>
+            <wp:effectExtent l="0" t="0" r="2540" b="5715"/>
+            <wp:docPr id="877018471" name="Picture 1" descr="The image shows a web interface with a login screen, a welcome message, a form for submitting error messages, and error messages related to invalid input.&#10;&#10;AI-generated content may be incorrect."/>
+            <wp:cNvGraphicFramePr>
+              <a:graphicFrameLocks xmlns:a="http://schemas.openxmlformats.org/drawingml/2006/main" noChangeAspect="1"/>
+            </wp:cNvGraphicFramePr>
+            <a:graphic xmlns:a="http://schemas.openxmlformats.org/drawingml/2006/main">
+              <a:graphicData uri="http://schemas.openxmlformats.org/drawingml/2006/picture">
+                <pic:pic xmlns:pic="http://schemas.openxmlformats.org/drawingml/2006/picture">
+                  <pic:nvPicPr>
+                    <pic:cNvPr id="877018471" name="Picture 1" descr="The image shows a web interface with a login screen, a welcome message, a form for submitting error messages, and error messages related to invalid input.&#10;&#10;AI-generated content may be incorrect."/>
+                    <pic:cNvPicPr/>
+                  </pic:nvPicPr>
+                  <pic:blipFill>
+                    <a:blip r:embed="rId37"/>
+                    <a:stretch>
+                      <a:fillRect/>
+                    </a:stretch>
+                  </pic:blipFill>
+                  <pic:spPr>
+                    <a:xfrm>
+                      <a:off x="0" y="0"/>
+                      <a:ext cx="5731510" cy="1556385"/>
+                    </a:xfrm>
+                    <a:prstGeom prst="rect">
+                      <a:avLst/>
+                    </a:prstGeom>
+                  </pic:spPr>
+                </pic:pic>
+              </a:graphicData>
+            </a:graphic>
+          </wp:inline>
+        </w:drawing>
+      </w:r>
+    </w:p>
+    <w:p/>
     <w:sectPr>
       <w:pgSz w:w="11906" w:h="16838"/>
       <w:pgMar w:top="1440" w:right="1440" w:bottom="1440" w:left="1440" w:header="708" w:footer="708" w:gutter="0"/>
@@ -1428,10 +1658,6 @@
     </w:sectPr>
   </w:body>
 </w:document>
-</file>
-
-<file path=word/numbering.xml><?xml version="1.0" encoding="utf-8"?>
-<w:numbering xmlns:wpc="http://schemas.microsoft.com/office/word/2010/wordprocessingCanvas" xmlns:cx="http://schemas.microsoft.com/office/drawing/2014/chartex" xmlns:cx1="http://schemas.microsoft.com/office/drawing/2015/9/8/chartex" xmlns:cx2="http://schemas.microsoft.com/office/drawing/2015/10/21/chartex" xmlns:cx3="http://schemas.microsoft.com/office/drawing/2016/5/9/chartex" xmlns:cx4="http://schemas.microsoft.com/office/drawing/2016/5/10/chartex" xmlns:cx5="http://schemas.microsoft.com/office/drawing/2016/5/11/chartex" xmlns:cx6="http://schemas.microsoft.com/office/drawing/2016/5/12/chartex" xmlns:cx7="http://schemas.microsoft.com/office/drawing/2016/5/13/chartex" xmlns:cx8="http://schemas.microsoft.com/office/drawing/2016/5/14/chartex" xmlns:mc="http://schemas.openxmlformats.org/markup-compatibility/2006" xmlns:aink="http://schemas.microsoft.com/office/drawing/2016/ink" xmlns:am3d="http://schemas.microsoft.com/office/drawing/2017/model3d" xmlns:o="urn:schemas-microsoft-com:office:office" xmlns:oel="http://schemas.microsoft.com/office/2019/extlst" xmlns:r="http://schemas.openxmlformats.org/officeDocument/2006/relationships" xmlns:m="http://schemas.openxmlformats.org/officeDocument/2006/math" xmlns:v="urn:schemas-microsoft-com:vml" xmlns:wp14="http://schemas.microsoft.com/office/word/2010/wordprocessingDrawing" xmlns:wp="http://schemas.openxmlformats.org/drawingml/2006/wordprocessingDrawing" xmlns:w10="urn:schemas-microsoft-com:office:word" xmlns:w="http://schemas.openxmlformats.org/wordprocessingml/2006/main" xmlns:w14="http://schemas.microsoft.com/office/word/2010/wordml" xmlns:w15="http://schemas.microsoft.com/office/word/2012/wordml" xmlns:w16cex="http://schemas.microsoft.com/office/word/2018/wordml/cex" xmlns:w16cid="http://schemas.microsoft.com/office/word/2016/wordml/cid" xmlns:w16="http://schemas.microsoft.com/office/word/2018/wordml" xmlns:w16du="http://schemas.microsoft.com/office/word/2023/wordml/word16du" xmlns:w16sdtdh="http://schemas.microsoft.com/office/word/2020/wordml/sdtdatahash" xmlns:w16sdtfl="http://schemas.microsoft.com/office/word/2024/wordml/sdtformatlock" xmlns:w16se="http://schemas.microsoft.com/office/word/2015/wordml/symex" xmlns:wpg="http://schemas.microsoft.com/office/word/2010/wordprocessingGroup" xmlns:wpi="http://schemas.microsoft.com/office/word/2010/wordprocessingInk" xmlns:wne="http://schemas.microsoft.com/office/word/2006/wordml" xmlns:wps="http://schemas.microsoft.com/office/word/2010/wordprocessingShape" mc:Ignorable="w14 w15 w16se w16cid w16 w16cex w16sdtdh w16sdtfl w16du wp14"/>
 </file>
 
 <file path=word/styles.xml><?xml version="1.0" encoding="utf-8"?>

</xml_diff>

<commit_message>
Completed Main Practical Build: Department Contact Form with Validation
</commit_message>
<xml_diff>
--- a/PM 03/pm03-contact-form/evidence/Ryan Ward PM-03.docx
+++ b/PM 03/pm03-contact-form/evidence/Ryan Ward PM-03.docx
@@ -1637,6 +1637,431 @@
                     <a:xfrm>
                       <a:off x="0" y="0"/>
                       <a:ext cx="5731510" cy="1556385"/>
+                    </a:xfrm>
+                    <a:prstGeom prst="rect">
+                      <a:avLst/>
+                    </a:prstGeom>
+                  </pic:spPr>
+                </pic:pic>
+              </a:graphicData>
+            </a:graphic>
+          </wp:inline>
+        </w:drawing>
+      </w:r>
+    </w:p>
+    <w:p>
+      <w:pPr>
+        <w:pStyle w:val="Heading2"/>
+      </w:pPr>
+      <w:r>
+        <w:t xml:space="preserve">Main Practical Build: Department </w:t>
+      </w:r>
+      <w:r>
+        <w:t>Contact Form with Validation.</w:t>
+      </w:r>
+    </w:p>
+    <w:p>
+      <w:r>
+        <w:rPr>
+          <w:noProof/>
+        </w:rPr>
+        <w:drawing>
+          <wp:inline distT="0" distB="0" distL="0" distR="0" wp14:anchorId="61CF2390" wp14:editId="1E431EFA">
+            <wp:extent cx="5731510" cy="6016625"/>
+            <wp:effectExtent l="0" t="0" r="2540" b="3175"/>
+            <wp:docPr id="768447717" name="Picture 1" descr="The image displays a filled-out Department Contact Form with fields for the user's full name, department selection, email address, issue category, and a text input for a message.&#10;&#10;AI-generated content may be incorrect."/>
+            <wp:cNvGraphicFramePr>
+              <a:graphicFrameLocks xmlns:a="http://schemas.openxmlformats.org/drawingml/2006/main" noChangeAspect="1"/>
+            </wp:cNvGraphicFramePr>
+            <a:graphic xmlns:a="http://schemas.openxmlformats.org/drawingml/2006/main">
+              <a:graphicData uri="http://schemas.openxmlformats.org/drawingml/2006/picture">
+                <pic:pic xmlns:pic="http://schemas.openxmlformats.org/drawingml/2006/picture">
+                  <pic:nvPicPr>
+                    <pic:cNvPr id="768447717" name="Picture 1" descr="The image displays a filled-out Department Contact Form with fields for the user's full name, department selection, email address, issue category, and a text input for a message.&#10;&#10;AI-generated content may be incorrect."/>
+                    <pic:cNvPicPr/>
+                  </pic:nvPicPr>
+                  <pic:blipFill>
+                    <a:blip r:embed="rId38"/>
+                    <a:stretch>
+                      <a:fillRect/>
+                    </a:stretch>
+                  </pic:blipFill>
+                  <pic:spPr>
+                    <a:xfrm>
+                      <a:off x="0" y="0"/>
+                      <a:ext cx="5731510" cy="6016625"/>
+                    </a:xfrm>
+                    <a:prstGeom prst="rect">
+                      <a:avLst/>
+                    </a:prstGeom>
+                  </pic:spPr>
+                </pic:pic>
+              </a:graphicData>
+            </a:graphic>
+          </wp:inline>
+        </w:drawing>
+      </w:r>
+    </w:p>
+    <w:p>
+      <w:r>
+        <w:rPr>
+          <w:noProof/>
+        </w:rPr>
+        <w:lastRenderedPageBreak/>
+        <w:drawing>
+          <wp:inline distT="0" distB="0" distL="0" distR="0" wp14:anchorId="5635C684" wp14:editId="2DC67D68">
+            <wp:extent cx="5731510" cy="6467475"/>
+            <wp:effectExtent l="0" t="0" r="2540" b="9525"/>
+            <wp:docPr id="1776625647" name="Picture 1" descr="The image displays a Department Contact Form with fields for user details, issue category, and a message submission button.&#10;&#10;AI-generated content may be incorrect."/>
+            <wp:cNvGraphicFramePr>
+              <a:graphicFrameLocks xmlns:a="http://schemas.openxmlformats.org/drawingml/2006/main" noChangeAspect="1"/>
+            </wp:cNvGraphicFramePr>
+            <a:graphic xmlns:a="http://schemas.openxmlformats.org/drawingml/2006/main">
+              <a:graphicData uri="http://schemas.openxmlformats.org/drawingml/2006/picture">
+                <pic:pic xmlns:pic="http://schemas.openxmlformats.org/drawingml/2006/picture">
+                  <pic:nvPicPr>
+                    <pic:cNvPr id="1776625647" name="Picture 1" descr="The image displays a Department Contact Form with fields for user details, issue category, and a message submission button.&#10;&#10;AI-generated content may be incorrect."/>
+                    <pic:cNvPicPr/>
+                  </pic:nvPicPr>
+                  <pic:blipFill>
+                    <a:blip r:embed="rId39"/>
+                    <a:stretch>
+                      <a:fillRect/>
+                    </a:stretch>
+                  </pic:blipFill>
+                  <pic:spPr>
+                    <a:xfrm>
+                      <a:off x="0" y="0"/>
+                      <a:ext cx="5731510" cy="6467475"/>
+                    </a:xfrm>
+                    <a:prstGeom prst="rect">
+                      <a:avLst/>
+                    </a:prstGeom>
+                  </pic:spPr>
+                </pic:pic>
+              </a:graphicData>
+            </a:graphic>
+          </wp:inline>
+        </w:drawing>
+      </w:r>
+    </w:p>
+    <w:p>
+      <w:r>
+        <w:rPr>
+          <w:noProof/>
+        </w:rPr>
+        <w:lastRenderedPageBreak/>
+        <w:drawing>
+          <wp:inline distT="0" distB="0" distL="0" distR="0" wp14:anchorId="0A7FFEBF" wp14:editId="1FE6DDC4">
+            <wp:extent cx="5731510" cy="6107430"/>
+            <wp:effectExtent l="0" t="0" r="2540" b="7620"/>
+            <wp:docPr id="311076180" name="Picture 1" descr="The image displays a web form with fields for submitting support messages to a department, including sections for personal information, department selection, issue category, and message input.&#10;&#10;AI-generated content may be incorrect."/>
+            <wp:cNvGraphicFramePr>
+              <a:graphicFrameLocks xmlns:a="http://schemas.openxmlformats.org/drawingml/2006/main" noChangeAspect="1"/>
+            </wp:cNvGraphicFramePr>
+            <a:graphic xmlns:a="http://schemas.openxmlformats.org/drawingml/2006/main">
+              <a:graphicData uri="http://schemas.openxmlformats.org/drawingml/2006/picture">
+                <pic:pic xmlns:pic="http://schemas.openxmlformats.org/drawingml/2006/picture">
+                  <pic:nvPicPr>
+                    <pic:cNvPr id="311076180" name="Picture 1" descr="The image displays a web form with fields for submitting support messages to a department, including sections for personal information, department selection, issue category, and message input.&#10;&#10;AI-generated content may be incorrect."/>
+                    <pic:cNvPicPr/>
+                  </pic:nvPicPr>
+                  <pic:blipFill>
+                    <a:blip r:embed="rId40"/>
+                    <a:stretch>
+                      <a:fillRect/>
+                    </a:stretch>
+                  </pic:blipFill>
+                  <pic:spPr>
+                    <a:xfrm>
+                      <a:off x="0" y="0"/>
+                      <a:ext cx="5731510" cy="6107430"/>
+                    </a:xfrm>
+                    <a:prstGeom prst="rect">
+                      <a:avLst/>
+                    </a:prstGeom>
+                  </pic:spPr>
+                </pic:pic>
+              </a:graphicData>
+            </a:graphic>
+          </wp:inline>
+        </w:drawing>
+      </w:r>
+    </w:p>
+    <w:p>
+      <w:r>
+        <w:rPr>
+          <w:noProof/>
+        </w:rPr>
+        <w:lastRenderedPageBreak/>
+        <w:drawing>
+          <wp:inline distT="0" distB="0" distL="0" distR="0" wp14:anchorId="6FE4C510" wp14:editId="6BC4B0CC">
+            <wp:extent cx="5731510" cy="6309995"/>
+            <wp:effectExtent l="0" t="0" r="2540" b="0"/>
+            <wp:docPr id="2138925112" name="Picture 1" descr="The image displays a Department Contact Form with fields for Full Name, Department, Email Address, Issue Category, and a message area, alongside buttons for submitting requests and clearing the list.&#10;&#10;AI-generated content may be incorrect."/>
+            <wp:cNvGraphicFramePr>
+              <a:graphicFrameLocks xmlns:a="http://schemas.openxmlformats.org/drawingml/2006/main" noChangeAspect="1"/>
+            </wp:cNvGraphicFramePr>
+            <a:graphic xmlns:a="http://schemas.openxmlformats.org/drawingml/2006/main">
+              <a:graphicData uri="http://schemas.openxmlformats.org/drawingml/2006/picture">
+                <pic:pic xmlns:pic="http://schemas.openxmlformats.org/drawingml/2006/picture">
+                  <pic:nvPicPr>
+                    <pic:cNvPr id="2138925112" name="Picture 1" descr="The image displays a Department Contact Form with fields for Full Name, Department, Email Address, Issue Category, and a message area, alongside buttons for submitting requests and clearing the list.&#10;&#10;AI-generated content may be incorrect."/>
+                    <pic:cNvPicPr/>
+                  </pic:nvPicPr>
+                  <pic:blipFill>
+                    <a:blip r:embed="rId41"/>
+                    <a:stretch>
+                      <a:fillRect/>
+                    </a:stretch>
+                  </pic:blipFill>
+                  <pic:spPr>
+                    <a:xfrm>
+                      <a:off x="0" y="0"/>
+                      <a:ext cx="5731510" cy="6309995"/>
+                    </a:xfrm>
+                    <a:prstGeom prst="rect">
+                      <a:avLst/>
+                    </a:prstGeom>
+                  </pic:spPr>
+                </pic:pic>
+              </a:graphicData>
+            </a:graphic>
+          </wp:inline>
+        </w:drawing>
+      </w:r>
+    </w:p>
+    <w:p>
+      <w:r>
+        <w:rPr>
+          <w:noProof/>
+        </w:rPr>
+        <w:lastRenderedPageBreak/>
+        <w:drawing>
+          <wp:inline distT="0" distB="0" distL="0" distR="0" wp14:anchorId="23535EB1" wp14:editId="4CADF390">
+            <wp:extent cx="5731510" cy="6004560"/>
+            <wp:effectExtent l="0" t="0" r="2540" b="0"/>
+            <wp:docPr id="916872557" name="Picture 1" descr="The image shows a Department Contact Form with fields for full name, department, email, issue category, message, and buttons to submit or clear the form.&#10;&#10;AI-generated content may be incorrect."/>
+            <wp:cNvGraphicFramePr>
+              <a:graphicFrameLocks xmlns:a="http://schemas.openxmlformats.org/drawingml/2006/main" noChangeAspect="1"/>
+            </wp:cNvGraphicFramePr>
+            <a:graphic xmlns:a="http://schemas.openxmlformats.org/drawingml/2006/main">
+              <a:graphicData uri="http://schemas.openxmlformats.org/drawingml/2006/picture">
+                <pic:pic xmlns:pic="http://schemas.openxmlformats.org/drawingml/2006/picture">
+                  <pic:nvPicPr>
+                    <pic:cNvPr id="916872557" name="Picture 1" descr="The image shows a Department Contact Form with fields for full name, department, email, issue category, message, and buttons to submit or clear the form.&#10;&#10;AI-generated content may be incorrect."/>
+                    <pic:cNvPicPr/>
+                  </pic:nvPicPr>
+                  <pic:blipFill>
+                    <a:blip r:embed="rId42"/>
+                    <a:stretch>
+                      <a:fillRect/>
+                    </a:stretch>
+                  </pic:blipFill>
+                  <pic:spPr>
+                    <a:xfrm>
+                      <a:off x="0" y="0"/>
+                      <a:ext cx="5731510" cy="6004560"/>
+                    </a:xfrm>
+                    <a:prstGeom prst="rect">
+                      <a:avLst/>
+                    </a:prstGeom>
+                  </pic:spPr>
+                </pic:pic>
+              </a:graphicData>
+            </a:graphic>
+          </wp:inline>
+        </w:drawing>
+      </w:r>
+    </w:p>
+    <w:p>
+      <w:r>
+        <w:rPr>
+          <w:noProof/>
+        </w:rPr>
+        <w:lastRenderedPageBreak/>
+        <w:drawing>
+          <wp:inline distT="0" distB="0" distL="0" distR="0" wp14:anchorId="0A30B71C" wp14:editId="35AB3045">
+            <wp:extent cx="5731510" cy="6049645"/>
+            <wp:effectExtent l="0" t="0" r="2540" b="8255"/>
+            <wp:docPr id="1551730819" name="Picture 1" descr="The image displays a filled-out Department Contact Form with a user's details, an issue category, a short message, and options for submitting or clearing the form.&#10;&#10;AI-generated content may be incorrect."/>
+            <wp:cNvGraphicFramePr>
+              <a:graphicFrameLocks xmlns:a="http://schemas.openxmlformats.org/drawingml/2006/main" noChangeAspect="1"/>
+            </wp:cNvGraphicFramePr>
+            <a:graphic xmlns:a="http://schemas.openxmlformats.org/drawingml/2006/main">
+              <a:graphicData uri="http://schemas.openxmlformats.org/drawingml/2006/picture">
+                <pic:pic xmlns:pic="http://schemas.openxmlformats.org/drawingml/2006/picture">
+                  <pic:nvPicPr>
+                    <pic:cNvPr id="1551730819" name="Picture 1" descr="The image displays a filled-out Department Contact Form with a user's details, an issue category, a short message, and options for submitting or clearing the form.&#10;&#10;AI-generated content may be incorrect."/>
+                    <pic:cNvPicPr/>
+                  </pic:nvPicPr>
+                  <pic:blipFill>
+                    <a:blip r:embed="rId43"/>
+                    <a:stretch>
+                      <a:fillRect/>
+                    </a:stretch>
+                  </pic:blipFill>
+                  <pic:spPr>
+                    <a:xfrm>
+                      <a:off x="0" y="0"/>
+                      <a:ext cx="5731510" cy="6049645"/>
+                    </a:xfrm>
+                    <a:prstGeom prst="rect">
+                      <a:avLst/>
+                    </a:prstGeom>
+                  </pic:spPr>
+                </pic:pic>
+              </a:graphicData>
+            </a:graphic>
+          </wp:inline>
+        </w:drawing>
+      </w:r>
+    </w:p>
+    <w:p>
+      <w:r>
+        <w:rPr>
+          <w:noProof/>
+        </w:rPr>
+        <w:lastRenderedPageBreak/>
+        <w:drawing>
+          <wp:inline distT="0" distB="0" distL="0" distR="0" wp14:anchorId="0A2BDDBB" wp14:editId="5AE9C954">
+            <wp:extent cx="5731510" cy="3289935"/>
+            <wp:effectExtent l="0" t="0" r="2540" b="5715"/>
+            <wp:docPr id="1770363797" name="Picture 1" descr="The image shows a web interface displaying a department contact form, with fields for name, department, email, message, and issue category.&#10;&#10;AI-generated content may be incorrect."/>
+            <wp:cNvGraphicFramePr>
+              <a:graphicFrameLocks xmlns:a="http://schemas.openxmlformats.org/drawingml/2006/main" noChangeAspect="1"/>
+            </wp:cNvGraphicFramePr>
+            <a:graphic xmlns:a="http://schemas.openxmlformats.org/drawingml/2006/main">
+              <a:graphicData uri="http://schemas.openxmlformats.org/drawingml/2006/picture">
+                <pic:pic xmlns:pic="http://schemas.openxmlformats.org/drawingml/2006/picture">
+                  <pic:nvPicPr>
+                    <pic:cNvPr id="1770363797" name="Picture 1" descr="The image shows a web interface displaying a department contact form, with fields for name, department, email, message, and issue category.&#10;&#10;AI-generated content may be incorrect."/>
+                    <pic:cNvPicPr/>
+                  </pic:nvPicPr>
+                  <pic:blipFill>
+                    <a:blip r:embed="rId44"/>
+                    <a:stretch>
+                      <a:fillRect/>
+                    </a:stretch>
+                  </pic:blipFill>
+                  <pic:spPr>
+                    <a:xfrm>
+                      <a:off x="0" y="0"/>
+                      <a:ext cx="5731510" cy="3289935"/>
+                    </a:xfrm>
+                    <a:prstGeom prst="rect">
+                      <a:avLst/>
+                    </a:prstGeom>
+                  </pic:spPr>
+                </pic:pic>
+              </a:graphicData>
+            </a:graphic>
+          </wp:inline>
+        </w:drawing>
+      </w:r>
+    </w:p>
+    <w:p>
+      <w:pPr>
+        <w:pStyle w:val="Heading2"/>
+      </w:pPr>
+      <w:r>
+        <w:t xml:space="preserve">10. Suggested API </w:t>
+      </w:r>
+      <w:r>
+        <w:t>Practical: Display Data from an API</w:t>
+      </w:r>
+    </w:p>
+    <w:p>
+      <w:pPr>
+        <w:pStyle w:val="Heading3"/>
+      </w:pPr>
+      <w:r>
+        <w:t xml:space="preserve">Basic </w:t>
+      </w:r>
+      <w:proofErr w:type="gramStart"/>
+      <w:r>
+        <w:t>fetch(</w:t>
+      </w:r>
+      <w:proofErr w:type="gramEnd"/>
+      <w:r>
+        <w:t>) Example</w:t>
+      </w:r>
+    </w:p>
+    <w:p/>
+    <w:p>
+      <w:r>
+        <w:rPr>
+          <w:noProof/>
+        </w:rPr>
+        <w:lastRenderedPageBreak/>
+        <w:drawing>
+          <wp:inline distT="0" distB="0" distL="0" distR="0" wp14:anchorId="0B8B4CEF" wp14:editId="2ACA8563">
+            <wp:extent cx="5731510" cy="5962015"/>
+            <wp:effectExtent l="0" t="0" r="2540" b="635"/>
+            <wp:docPr id="778349497" name="Picture 1" descr="The image depicts a user interface for a Department Contact Form, with fields for personal information, department selection, issue categorization, message input, and submission options.&#10;&#10;AI-generated content may be incorrect."/>
+            <wp:cNvGraphicFramePr>
+              <a:graphicFrameLocks xmlns:a="http://schemas.openxmlformats.org/drawingml/2006/main" noChangeAspect="1"/>
+            </wp:cNvGraphicFramePr>
+            <a:graphic xmlns:a="http://schemas.openxmlformats.org/drawingml/2006/main">
+              <a:graphicData uri="http://schemas.openxmlformats.org/drawingml/2006/picture">
+                <pic:pic xmlns:pic="http://schemas.openxmlformats.org/drawingml/2006/picture">
+                  <pic:nvPicPr>
+                    <pic:cNvPr id="778349497" name="Picture 1" descr="The image depicts a user interface for a Department Contact Form, with fields for personal information, department selection, issue categorization, message input, and submission options.&#10;&#10;AI-generated content may be incorrect."/>
+                    <pic:cNvPicPr/>
+                  </pic:nvPicPr>
+                  <pic:blipFill>
+                    <a:blip r:embed="rId45"/>
+                    <a:stretch>
+                      <a:fillRect/>
+                    </a:stretch>
+                  </pic:blipFill>
+                  <pic:spPr>
+                    <a:xfrm>
+                      <a:off x="0" y="0"/>
+                      <a:ext cx="5731510" cy="5962015"/>
+                    </a:xfrm>
+                    <a:prstGeom prst="rect">
+                      <a:avLst/>
+                    </a:prstGeom>
+                  </pic:spPr>
+                </pic:pic>
+              </a:graphicData>
+            </a:graphic>
+          </wp:inline>
+        </w:drawing>
+      </w:r>
+    </w:p>
+    <w:p>
+      <w:r>
+        <w:rPr>
+          <w:noProof/>
+        </w:rPr>
+        <w:lastRenderedPageBreak/>
+        <w:drawing>
+          <wp:inline distT="0" distB="0" distL="0" distR="0" wp14:anchorId="5807550B" wp14:editId="35F9F6FF">
+            <wp:extent cx="5731510" cy="3471545"/>
+            <wp:effectExtent l="0" t="0" r="2540" b="0"/>
+            <wp:docPr id="64670607" name="Picture 1" descr="The image shows a web interface displaying a Department Contact Form, where a user named Ryan Gosling is submitting a support message regarding an offline trading service issue.&#10;&#10;AI-generated content may be incorrect."/>
+            <wp:cNvGraphicFramePr>
+              <a:graphicFrameLocks xmlns:a="http://schemas.openxmlformats.org/drawingml/2006/main" noChangeAspect="1"/>
+            </wp:cNvGraphicFramePr>
+            <a:graphic xmlns:a="http://schemas.openxmlformats.org/drawingml/2006/main">
+              <a:graphicData uri="http://schemas.openxmlformats.org/drawingml/2006/picture">
+                <pic:pic xmlns:pic="http://schemas.openxmlformats.org/drawingml/2006/picture">
+                  <pic:nvPicPr>
+                    <pic:cNvPr id="64670607" name="Picture 1" descr="The image shows a web interface displaying a Department Contact Form, where a user named Ryan Gosling is submitting a support message regarding an offline trading service issue.&#10;&#10;AI-generated content may be incorrect."/>
+                    <pic:cNvPicPr/>
+                  </pic:nvPicPr>
+                  <pic:blipFill>
+                    <a:blip r:embed="rId46"/>
+                    <a:stretch>
+                      <a:fillRect/>
+                    </a:stretch>
+                  </pic:blipFill>
+                  <pic:spPr>
+                    <a:xfrm>
+                      <a:off x="0" y="0"/>
+                      <a:ext cx="5731510" cy="3471545"/>
                     </a:xfrm>
                     <a:prstGeom prst="rect">
                       <a:avLst/>

</xml_diff>

<commit_message>
Activity 11 completed for PM-03
</commit_message>
<xml_diff>
--- a/PM 03/pm03-contact-form/evidence/Ryan Ward PM-03.docx
+++ b/PM 03/pm03-contact-form/evidence/Ryan Ward PM-03.docx
@@ -1707,7 +1707,6 @@
         <w:rPr>
           <w:noProof/>
         </w:rPr>
-        <w:lastRenderedPageBreak/>
         <w:drawing>
           <wp:inline distT="0" distB="0" distL="0" distR="0" wp14:anchorId="5635C684" wp14:editId="2DC67D68">
             <wp:extent cx="5731510" cy="6467475"/>
@@ -1750,7 +1749,6 @@
         <w:rPr>
           <w:noProof/>
         </w:rPr>
-        <w:lastRenderedPageBreak/>
         <w:drawing>
           <wp:inline distT="0" distB="0" distL="0" distR="0" wp14:anchorId="0A7FFEBF" wp14:editId="1FE6DDC4">
             <wp:extent cx="5731510" cy="6107430"/>
@@ -1793,7 +1791,6 @@
         <w:rPr>
           <w:noProof/>
         </w:rPr>
-        <w:lastRenderedPageBreak/>
         <w:drawing>
           <wp:inline distT="0" distB="0" distL="0" distR="0" wp14:anchorId="6FE4C510" wp14:editId="6BC4B0CC">
             <wp:extent cx="5731510" cy="6309995"/>
@@ -1836,7 +1833,6 @@
         <w:rPr>
           <w:noProof/>
         </w:rPr>
-        <w:lastRenderedPageBreak/>
         <w:drawing>
           <wp:inline distT="0" distB="0" distL="0" distR="0" wp14:anchorId="23535EB1" wp14:editId="4CADF390">
             <wp:extent cx="5731510" cy="6004560"/>
@@ -1879,7 +1875,6 @@
         <w:rPr>
           <w:noProof/>
         </w:rPr>
-        <w:lastRenderedPageBreak/>
         <w:drawing>
           <wp:inline distT="0" distB="0" distL="0" distR="0" wp14:anchorId="0A30B71C" wp14:editId="35AB3045">
             <wp:extent cx="5731510" cy="6049645"/>
@@ -1922,7 +1917,6 @@
         <w:rPr>
           <w:noProof/>
         </w:rPr>
-        <w:lastRenderedPageBreak/>
         <w:drawing>
           <wp:inline distT="0" distB="0" distL="0" distR="0" wp14:anchorId="0A2BDDBB" wp14:editId="5AE9C954">
             <wp:extent cx="5731510" cy="3289935"/>
@@ -1960,40 +1954,12 @@
         </w:drawing>
       </w:r>
     </w:p>
-    <w:p>
-      <w:pPr>
-        <w:pStyle w:val="Heading2"/>
-      </w:pPr>
-      <w:r>
-        <w:t xml:space="preserve">10. Suggested API </w:t>
-      </w:r>
-      <w:r>
-        <w:t>Practical: Display Data from an API</w:t>
-      </w:r>
-    </w:p>
-    <w:p>
-      <w:pPr>
-        <w:pStyle w:val="Heading3"/>
-      </w:pPr>
-      <w:r>
-        <w:t xml:space="preserve">Basic </w:t>
-      </w:r>
-      <w:proofErr w:type="gramStart"/>
-      <w:r>
-        <w:t>fetch(</w:t>
-      </w:r>
-      <w:proofErr w:type="gramEnd"/>
-      <w:r>
-        <w:t>) Example</w:t>
-      </w:r>
-    </w:p>
     <w:p/>
     <w:p>
       <w:r>
         <w:rPr>
           <w:noProof/>
         </w:rPr>
-        <w:lastRenderedPageBreak/>
         <w:drawing>
           <wp:inline distT="0" distB="0" distL="0" distR="0" wp14:anchorId="0B8B4CEF" wp14:editId="2ACA8563">
             <wp:extent cx="5731510" cy="5962015"/>
@@ -2036,7 +2002,6 @@
         <w:rPr>
           <w:noProof/>
         </w:rPr>
-        <w:lastRenderedPageBreak/>
         <w:drawing>
           <wp:inline distT="0" distB="0" distL="0" distR="0" wp14:anchorId="5807550B" wp14:editId="35F9F6FF">
             <wp:extent cx="5731510" cy="3471545"/>

</xml_diff>

<commit_message>
PM-03 completed and README files added
</commit_message>
<xml_diff>
--- a/PM 03/pm03-contact-form/evidence/Ryan Ward PM-03.docx
+++ b/PM 03/pm03-contact-form/evidence/Ryan Ward PM-03.docx
@@ -2039,7 +2039,243 @@
         </w:drawing>
       </w:r>
     </w:p>
-    <w:p/>
+    <w:p>
+      <w:pPr>
+        <w:pStyle w:val="Heading2"/>
+      </w:pPr>
+      <w:r>
+        <w:t xml:space="preserve">11. Light </w:t>
+      </w:r>
+      <w:r>
+        <w:t>Animation and Multimedia Awareness</w:t>
+      </w:r>
+    </w:p>
+    <w:p>
+      <w:pPr>
+        <w:pStyle w:val="Heading3"/>
+      </w:pPr>
+      <w:r>
+        <w:t>Show/Hide Example</w:t>
+      </w:r>
+    </w:p>
+    <w:p>
+      <w:r>
+        <w:rPr>
+          <w:noProof/>
+        </w:rPr>
+        <w:drawing>
+          <wp:inline distT="0" distB="0" distL="0" distR="0" wp14:anchorId="592AA491" wp14:editId="28AE498F">
+            <wp:extent cx="5731510" cy="2058035"/>
+            <wp:effectExtent l="0" t="0" r="2540" b="0"/>
+            <wp:docPr id="888012050" name="Picture 1" descr="detailsPanel&#10;&#10;AI-generated content may be incorrect."/>
+            <wp:cNvGraphicFramePr>
+              <a:graphicFrameLocks xmlns:a="http://schemas.openxmlformats.org/drawingml/2006/main" noChangeAspect="1"/>
+            </wp:cNvGraphicFramePr>
+            <a:graphic xmlns:a="http://schemas.openxmlformats.org/drawingml/2006/main">
+              <a:graphicData uri="http://schemas.openxmlformats.org/drawingml/2006/picture">
+                <pic:pic xmlns:pic="http://schemas.openxmlformats.org/drawingml/2006/picture">
+                  <pic:nvPicPr>
+                    <pic:cNvPr id="888012050" name="Picture 1" descr="detailsPanel&#10;&#10;AI-generated content may be incorrect."/>
+                    <pic:cNvPicPr/>
+                  </pic:nvPicPr>
+                  <pic:blipFill>
+                    <a:blip r:embed="rId47"/>
+                    <a:stretch>
+                      <a:fillRect/>
+                    </a:stretch>
+                  </pic:blipFill>
+                  <pic:spPr>
+                    <a:xfrm>
+                      <a:off x="0" y="0"/>
+                      <a:ext cx="5731510" cy="2058035"/>
+                    </a:xfrm>
+                    <a:prstGeom prst="rect">
+                      <a:avLst/>
+                    </a:prstGeom>
+                  </pic:spPr>
+                </pic:pic>
+              </a:graphicData>
+            </a:graphic>
+          </wp:inline>
+        </w:drawing>
+      </w:r>
+    </w:p>
+    <w:p>
+      <w:r>
+        <w:rPr>
+          <w:noProof/>
+        </w:rPr>
+        <w:drawing>
+          <wp:inline distT="0" distB="0" distL="0" distR="0" wp14:anchorId="293A540E" wp14:editId="4148C718">
+            <wp:extent cx="5731510" cy="3877945"/>
+            <wp:effectExtent l="0" t="0" r="2540" b="8255"/>
+            <wp:docPr id="412237679" name="Picture 1" descr="The image is a web form with fields for submitting a request, including personal details and error explanations.&#10;&#10;AI-generated content may be incorrect."/>
+            <wp:cNvGraphicFramePr>
+              <a:graphicFrameLocks xmlns:a="http://schemas.openxmlformats.org/drawingml/2006/main" noChangeAspect="1"/>
+            </wp:cNvGraphicFramePr>
+            <a:graphic xmlns:a="http://schemas.openxmlformats.org/drawingml/2006/main">
+              <a:graphicData uri="http://schemas.openxmlformats.org/drawingml/2006/picture">
+                <pic:pic xmlns:pic="http://schemas.openxmlformats.org/drawingml/2006/picture">
+                  <pic:nvPicPr>
+                    <pic:cNvPr id="412237679" name="Picture 1" descr="The image is a web form with fields for submitting a request, including personal details and error explanations.&#10;&#10;AI-generated content may be incorrect."/>
+                    <pic:cNvPicPr/>
+                  </pic:nvPicPr>
+                  <pic:blipFill>
+                    <a:blip r:embed="rId48"/>
+                    <a:stretch>
+                      <a:fillRect/>
+                    </a:stretch>
+                  </pic:blipFill>
+                  <pic:spPr>
+                    <a:xfrm>
+                      <a:off x="0" y="0"/>
+                      <a:ext cx="5731510" cy="3877945"/>
+                    </a:xfrm>
+                    <a:prstGeom prst="rect">
+                      <a:avLst/>
+                    </a:prstGeom>
+                  </pic:spPr>
+                </pic:pic>
+              </a:graphicData>
+            </a:graphic>
+          </wp:inline>
+        </w:drawing>
+      </w:r>
+    </w:p>
+    <w:p>
+      <w:r>
+        <w:rPr>
+          <w:noProof/>
+        </w:rPr>
+        <w:drawing>
+          <wp:inline distT="0" distB="0" distL="0" distR="0" wp14:anchorId="44E4D5AA" wp14:editId="550C56FA">
+            <wp:extent cx="5731510" cy="4327525"/>
+            <wp:effectExtent l="0" t="0" r="2540" b="0"/>
+            <wp:docPr id="1679050608" name="Picture 1" descr="The image displays a web form with sections for submitting a new request, including fields for name, department, error description, email, message, and additional support information.&#10;&#10;AI-generated content may be incorrect."/>
+            <wp:cNvGraphicFramePr>
+              <a:graphicFrameLocks xmlns:a="http://schemas.openxmlformats.org/drawingml/2006/main" noChangeAspect="1"/>
+            </wp:cNvGraphicFramePr>
+            <a:graphic xmlns:a="http://schemas.openxmlformats.org/drawingml/2006/main">
+              <a:graphicData uri="http://schemas.openxmlformats.org/drawingml/2006/picture">
+                <pic:pic xmlns:pic="http://schemas.openxmlformats.org/drawingml/2006/picture">
+                  <pic:nvPicPr>
+                    <pic:cNvPr id="1679050608" name="Picture 1" descr="The image displays a web form with sections for submitting a new request, including fields for name, department, error description, email, message, and additional support information.&#10;&#10;AI-generated content may be incorrect."/>
+                    <pic:cNvPicPr/>
+                  </pic:nvPicPr>
+                  <pic:blipFill>
+                    <a:blip r:embed="rId49"/>
+                    <a:stretch>
+                      <a:fillRect/>
+                    </a:stretch>
+                  </pic:blipFill>
+                  <pic:spPr>
+                    <a:xfrm>
+                      <a:off x="0" y="0"/>
+                      <a:ext cx="5731510" cy="4327525"/>
+                    </a:xfrm>
+                    <a:prstGeom prst="rect">
+                      <a:avLst/>
+                    </a:prstGeom>
+                  </pic:spPr>
+                </pic:pic>
+              </a:graphicData>
+            </a:graphic>
+          </wp:inline>
+        </w:drawing>
+      </w:r>
+    </w:p>
+    <w:p>
+      <w:pPr>
+        <w:pStyle w:val="Heading3"/>
+      </w:pPr>
+      <w:r>
+        <w:t>CSS Class Animation Example:</w:t>
+      </w:r>
+    </w:p>
+    <w:p>
+      <w:r>
+        <w:rPr>
+          <w:noProof/>
+        </w:rPr>
+        <w:drawing>
+          <wp:inline distT="0" distB="0" distL="0" distR="0" wp14:anchorId="679ECC68" wp14:editId="05263BEF">
+            <wp:extent cx="5731510" cy="1951990"/>
+            <wp:effectExtent l="0" t="0" r="2540" b="0"/>
+            <wp:docPr id="1232803114" name="Picture 1" descr="outputMessage&#10;&#10;AI-generated content may be incorrect."/>
+            <wp:cNvGraphicFramePr>
+              <a:graphicFrameLocks xmlns:a="http://schemas.openxmlformats.org/drawingml/2006/main" noChangeAspect="1"/>
+            </wp:cNvGraphicFramePr>
+            <a:graphic xmlns:a="http://schemas.openxmlformats.org/drawingml/2006/main">
+              <a:graphicData uri="http://schemas.openxmlformats.org/drawingml/2006/picture">
+                <pic:pic xmlns:pic="http://schemas.openxmlformats.org/drawingml/2006/picture">
+                  <pic:nvPicPr>
+                    <pic:cNvPr id="1232803114" name="Picture 1" descr="outputMessage&#10;&#10;AI-generated content may be incorrect."/>
+                    <pic:cNvPicPr/>
+                  </pic:nvPicPr>
+                  <pic:blipFill>
+                    <a:blip r:embed="rId50"/>
+                    <a:stretch>
+                      <a:fillRect/>
+                    </a:stretch>
+                  </pic:blipFill>
+                  <pic:spPr>
+                    <a:xfrm>
+                      <a:off x="0" y="0"/>
+                      <a:ext cx="5731510" cy="1951990"/>
+                    </a:xfrm>
+                    <a:prstGeom prst="rect">
+                      <a:avLst/>
+                    </a:prstGeom>
+                  </pic:spPr>
+                </pic:pic>
+              </a:graphicData>
+            </a:graphic>
+          </wp:inline>
+        </w:drawing>
+      </w:r>
+    </w:p>
+    <w:p>
+      <w:r>
+        <w:rPr>
+          <w:noProof/>
+        </w:rPr>
+        <w:drawing>
+          <wp:inline distT="0" distB="0" distL="0" distR="0" wp14:anchorId="471E760D" wp14:editId="6E22466D">
+            <wp:extent cx="5731510" cy="2213610"/>
+            <wp:effectExtent l="0" t="0" r="2540" b="0"/>
+            <wp:docPr id="1720184321" name="Picture 1" descr="The image shows a webpage interface for a helpdesk or support form, with fields for user details and submission history, and buttons for submitting, clearing status, and triggering an animation.&#10;&#10;AI-generated content may be incorrect."/>
+            <wp:cNvGraphicFramePr>
+              <a:graphicFrameLocks xmlns:a="http://schemas.openxmlformats.org/drawingml/2006/main" noChangeAspect="1"/>
+            </wp:cNvGraphicFramePr>
+            <a:graphic xmlns:a="http://schemas.openxmlformats.org/drawingml/2006/main">
+              <a:graphicData uri="http://schemas.openxmlformats.org/drawingml/2006/picture">
+                <pic:pic xmlns:pic="http://schemas.openxmlformats.org/drawingml/2006/picture">
+                  <pic:nvPicPr>
+                    <pic:cNvPr id="1720184321" name="Picture 1" descr="The image shows a webpage interface for a helpdesk or support form, with fields for user details and submission history, and buttons for submitting, clearing status, and triggering an animation.&#10;&#10;AI-generated content may be incorrect."/>
+                    <pic:cNvPicPr/>
+                  </pic:nvPicPr>
+                  <pic:blipFill>
+                    <a:blip r:embed="rId51"/>
+                    <a:stretch>
+                      <a:fillRect/>
+                    </a:stretch>
+                  </pic:blipFill>
+                  <pic:spPr>
+                    <a:xfrm>
+                      <a:off x="0" y="0"/>
+                      <a:ext cx="5731510" cy="2213610"/>
+                    </a:xfrm>
+                    <a:prstGeom prst="rect">
+                      <a:avLst/>
+                    </a:prstGeom>
+                  </pic:spPr>
+                </pic:pic>
+              </a:graphicData>
+            </a:graphic>
+          </wp:inline>
+        </w:drawing>
+      </w:r>
+    </w:p>
     <w:sectPr>
       <w:pgSz w:w="11906" w:h="16838"/>
       <w:pgMar w:top="1440" w:right="1440" w:bottom="1440" w:left="1440" w:header="708" w:footer="708" w:gutter="0"/>

</xml_diff>